<commit_message>
Trames et corrigés ENT-2.2, 2.4, 2.6 refaits pour l'écran Extractions (Cowork) : critères selon le niveau, aucun nombre de lignes attendu
Co-Authored-By: Claude Opus 5.5 <noreply@anthropic.com>
</commit_message>
<xml_diff>
--- a/contenus/trames/ENT-2.2-cdiscount-chiffres-trame-eleve.docx
+++ b/contenus/trames/ENT-2.2-cdiscount-chiffres-trame-eleve.docx
@@ -344,7 +344,7 @@
               <w:rPr>
                 <w:sz w:val="20"/>
               </w:rPr>
-              <w:t>cinq points : ton export, tes trois calculs dans le fichier que tu déposes, et la liste que tu envoies à ta cheffe d'équipe. Quand tu déposes ton fichier, le site te dit ce qui est juste et ce qui cloche : tu peux le corriger et le déposer de nouveau.</w:t>
+              <w:t>cinq points : ton export, tes trois calculs dans le fichier que tu déposes, et la liste que tu envoies à ta cheffe d'équipe. Quand tu déposes ton fichier, le site juge aussi ton export, à part : s'il n'a pas les bonnes lignes, il te dit quel critère changer. Pour tes calculs, il te dit ce qui est juste et ce qui cloche : tu peux corriger et déposer de nouveau.</w:t>
             </w:r>
           </w:p>
         </w:tc>
@@ -683,7 +683,7 @@
               <w:rPr>
                 <w:sz w:val="20"/>
               </w:rPr>
-              <w:t>Exporter et ouvrir le fichier</w:t>
+              <w:t>Vérifier l'extraction, exporter, ouvrir</w:t>
             </w:r>
           </w:p>
         </w:tc>
@@ -1646,7 +1646,34 @@
               <w:rPr>
                 <w:sz w:val="20"/>
               </w:rPr>
-              <w:t>Où trouves-tu le bouton pour exporter (quel menu) ?</w:t>
+              <w:t>Dans quel menu fais-tu l'export ?</w:t>
+            </w:r>
+          </w:p>
+        </w:tc>
+        <w:tc>
+          <w:tcPr>
+            <w:tcW w:type="dxa" w:w="4762"/>
+          </w:tcPr>
+          <w:p/>
+        </w:tc>
+      </w:tr>
+      <w:tr>
+        <w:trPr>
+          <w:trHeight w:val="567"/>
+        </w:trPr>
+        <w:tc>
+          <w:tcPr>
+            <w:tcW w:type="dxa" w:w="4876"/>
+          </w:tcPr>
+          <w:p>
+            <w:pPr>
+              <w:spacing w:after="0"/>
+            </w:pPr>
+            <w:r>
+              <w:rPr>
+                <w:sz w:val="20"/>
+              </w:rPr>
+              <w:t>Quelle liste exportes-tu ?</w:t>
             </w:r>
           </w:p>
         </w:tc>
@@ -1930,7 +1957,20 @@
           <w:color w:val="111111"/>
           <w:sz w:val="30"/>
         </w:rPr>
-        <w:t>Exporter et ouvrir le fichier</w:t>
+        <w:t>Vérifier l'extraction, exporter, ouvrir</w:t>
+      </w:r>
+    </w:p>
+    <w:p>
+      <w:pPr>
+        <w:spacing w:before="0" w:after="120"/>
+      </w:pPr>
+      <w:r>
+        <w:rPr>
+          <w:b w:val="0"/>
+          <w:color w:val="1A1A1A"/>
+          <w:sz w:val="22"/>
+        </w:rPr>
+        <w:t>Dans un logiciel d'entrepôt, on n'exporte pas tout : on choisit d'abord les lignes à sortir, avec des critères. Ici, les critères sont déjà réglés pour toi. Ton travail : les vérifier et comprendre pourquoi ce sont les bons.</w:t>
       </w:r>
     </w:p>
     <w:p>
@@ -1951,7 +1991,7 @@
         <w:rPr>
           <w:sz w:val="22"/>
         </w:rPr>
-        <w:t>Dans le menu de gauche, clique sur « Commandes ». En haut de la liste, clique sur « Exporter les lignes de préparation ».</w:t>
+        <w:t>Dans le menu de gauche, partie « Outils », clique sur « Extractions ». La liste « Lignes de préparation » s'affiche : ses critères sont au-dessus du tableau.</w:t>
       </w:r>
     </w:p>
     <w:p>
@@ -1972,7 +2012,7 @@
         <w:rPr>
           <w:sz w:val="22"/>
         </w:rPr>
-        <w:t>Le fichier cdiscount-preparations-allee-A.xlsx se télécharge. Ouvre-le dans ton tableur.</w:t>
+        <w:t>Vérifie les deux critères : « Allée » doit être sur « A », et « Période » sur « 30 derniers jours ».</w:t>
       </w:r>
     </w:p>
     <w:p>
@@ -1988,6 +2028,48 @@
           <w:sz w:val="22"/>
         </w:rPr>
         <w:t xml:space="preserve">3.  </w:t>
+      </w:r>
+      <w:r>
+        <w:rPr>
+          <w:sz w:val="22"/>
+        </w:rPr>
+        <w:t>Sous les critères, à gauche du bouton « Exporter », lis le nombre de lignes : c'est ce que contiendra ton fichier.</w:t>
+      </w:r>
+    </w:p>
+    <w:p>
+      <w:pPr>
+        <w:keepNext/>
+        <w:spacing w:after="80"/>
+        <w:ind w:left="454" w:hanging="454"/>
+      </w:pPr>
+      <w:r>
+        <w:rPr>
+          <w:b/>
+          <w:color w:val="111111"/>
+          <w:sz w:val="22"/>
+        </w:rPr>
+        <w:t xml:space="preserve">4.  </w:t>
+      </w:r>
+      <w:r>
+        <w:rPr>
+          <w:sz w:val="22"/>
+        </w:rPr>
+        <w:t>Clique sur « Exporter ». Le fichier cdiscount-lignes-de-preparation.xlsx se télécharge. Ouvre-le dans ton tableur.</w:t>
+      </w:r>
+    </w:p>
+    <w:p>
+      <w:pPr>
+        <w:keepNext/>
+        <w:spacing w:after="80"/>
+        <w:ind w:left="454" w:hanging="454"/>
+      </w:pPr>
+      <w:r>
+        <w:rPr>
+          <w:b/>
+          <w:color w:val="111111"/>
+          <w:sz w:val="22"/>
+        </w:rPr>
+        <w:t xml:space="preserve">5.  </w:t>
       </w:r>
       <w:r>
         <w:rPr>
@@ -2026,7 +2108,276 @@
                 <w:color w:val="111111"/>
                 <w:sz w:val="20"/>
               </w:rPr>
-              <w:t>Ce que tu dois voir :</w:t>
+              <w:t>Pourquoi ces critères ?</w:t>
+            </w:r>
+          </w:p>
+          <w:p>
+            <w:pPr>
+              <w:keepNext/>
+              <w:spacing w:before="0" w:after="40"/>
+              <w:ind w:left="397" w:hanging="227"/>
+            </w:pPr>
+            <w:r>
+              <w:rPr>
+                <w:sz w:val="20"/>
+              </w:rPr>
+              <w:t>•  Allée « A » : Nadia veut vérifier l'allée A. Les lignes des allées B et C ne la concernent pas : elles fausseraient tes comptes ;</w:t>
+            </w:r>
+          </w:p>
+          <w:p>
+            <w:pPr>
+              <w:spacing w:before="0" w:after="0"/>
+              <w:ind w:left="397" w:hanging="227"/>
+            </w:pPr>
+            <w:r>
+              <w:rPr>
+                <w:sz w:val="20"/>
+              </w:rPr>
+              <w:t>•  Période « 30 derniers jours » : Nadia veut savoir si le stock est faux maintenant. Un constat d'il y a deux mois ne dit plus grand-chose : le stock a pu être corrigé depuis.</w:t>
+            </w:r>
+          </w:p>
+        </w:tc>
+      </w:tr>
+    </w:tbl>
+    <w:p>
+      <w:pPr>
+        <w:keepNext/>
+        <w:spacing w:after="40"/>
+      </w:pPr>
+    </w:p>
+    <w:tbl>
+      <w:tblPr>
+        <w:tblStyle w:val="TableGrid"/>
+        <w:tblW w:type="auto" w:w="0"/>
+        <w:jc w:val="left"/>
+        <w:tblLook w:firstColumn="1" w:firstRow="1" w:lastColumn="0" w:lastRow="0" w:noHBand="0" w:noVBand="1" w:val="04A0"/>
+      </w:tblPr>
+      <w:tblGrid>
+        <w:gridCol w:w="10086"/>
+      </w:tblGrid>
+      <w:tr>
+        <w:tc>
+          <w:tcPr>
+            <w:tcW w:type="dxa" w:w="10086"/>
+            <w:shd w:fill="F2F2F2"/>
+          </w:tcPr>
+          <w:p>
+            <w:pPr>
+              <w:spacing w:after="0"/>
+            </w:pPr>
+            <w:r>
+              <w:rPr>
+                <w:b/>
+                <w:color w:val="111111"/>
+                <w:sz w:val="20"/>
+              </w:rPr>
+              <w:t xml:space="preserve">Pour voir, avant d'exporter : </w:t>
+            </w:r>
+            <w:r>
+              <w:rPr>
+                <w:sz w:val="20"/>
+              </w:rPr>
+              <w:t>mets « Allée » sur « Toutes » et regarde le tableau et le nombre de lignes changer. Puis remets « A ». Fais-le aussi avec la « Période ». Exporte seulement quand les deux critères sont revenus sur ceux de Nadia.</w:t>
+            </w:r>
+          </w:p>
+        </w:tc>
+      </w:tr>
+    </w:tbl>
+    <w:p>
+      <w:pPr>
+        <w:keepNext/>
+        <w:spacing w:after="40"/>
+      </w:pPr>
+    </w:p>
+    <w:tbl>
+      <w:tblPr>
+        <w:tblStyle w:val="TableGrid"/>
+        <w:tblW w:type="auto" w:w="0"/>
+        <w:tblLook w:firstColumn="1" w:firstRow="1" w:lastColumn="0" w:lastRow="0" w:noHBand="0" w:noVBand="1" w:val="04A0"/>
+      </w:tblPr>
+      <w:tblGrid>
+        <w:gridCol w:w="10086"/>
+      </w:tblGrid>
+      <w:tr>
+        <w:trPr>
+          <w:cantSplit/>
+          <w:trHeight w:val="1474"/>
+        </w:trPr>
+        <w:tc>
+          <w:tcPr>
+            <w:tcW w:type="dxa" w:w="10086"/>
+            <w:shd w:fill="FAFAFA"/>
+          </w:tcPr>
+          <w:p>
+            <w:pPr>
+              <w:spacing w:after="80"/>
+            </w:pPr>
+            <w:r>
+              <w:rPr>
+                <w:b/>
+                <w:sz w:val="21"/>
+              </w:rPr>
+              <w:t>Avec « Allée » sur « Toutes », le nombre de lignes augmente ou diminue ? Pourquoi ?</w:t>
+            </w:r>
+          </w:p>
+          <w:p>
+            <w:pPr>
+              <w:spacing w:before="0" w:after="80"/>
+            </w:pPr>
+            <w:r>
+              <w:rPr>
+                <w:sz w:val="22"/>
+              </w:rPr>
+            </w:r>
+          </w:p>
+          <w:p>
+            <w:pPr>
+              <w:spacing w:before="0" w:after="80"/>
+            </w:pPr>
+            <w:r>
+              <w:rPr>
+                <w:sz w:val="22"/>
+              </w:rPr>
+            </w:r>
+          </w:p>
+        </w:tc>
+      </w:tr>
+    </w:tbl>
+    <w:p>
+      <w:pPr>
+        <w:keepNext/>
+        <w:spacing w:after="0" w:line="60" w:lineRule="exact"/>
+      </w:pPr>
+      <w:r>
+        <w:rPr>
+          <w:sz w:val="10"/>
+        </w:rPr>
+      </w:r>
+    </w:p>
+    <w:tbl>
+      <w:tblPr>
+        <w:tblStyle w:val="TableGrid"/>
+        <w:tblW w:type="auto" w:w="0"/>
+        <w:tblLayout w:type="fixed"/>
+        <w:tblLook w:firstColumn="1" w:firstRow="1" w:lastColumn="0" w:lastRow="0" w:noHBand="0" w:noVBand="1" w:val="04A0"/>
+      </w:tblPr>
+      <w:tblGrid>
+        <w:gridCol w:w="5896"/>
+        <w:gridCol w:w="3742"/>
+      </w:tblGrid>
+      <w:tr>
+        <w:tc>
+          <w:tcPr>
+            <w:tcW w:type="dxa" w:w="5896"/>
+            <w:shd w:fill="E8E8E8"/>
+          </w:tcPr>
+          <w:p>
+            <w:pPr>
+              <w:keepNext/>
+              <w:spacing w:after="0"/>
+            </w:pPr>
+            <w:r>
+              <w:rPr>
+                <w:b/>
+                <w:color w:val="111111"/>
+                <w:sz w:val="20"/>
+              </w:rPr>
+              <w:t>Question</w:t>
+            </w:r>
+          </w:p>
+        </w:tc>
+        <w:tc>
+          <w:tcPr>
+            <w:tcW w:type="dxa" w:w="3742"/>
+            <w:shd w:fill="E8E8E8"/>
+          </w:tcPr>
+          <w:p>
+            <w:pPr>
+              <w:keepNext/>
+              <w:spacing w:after="0"/>
+            </w:pPr>
+            <w:r>
+              <w:rPr>
+                <w:b/>
+                <w:color w:val="111111"/>
+                <w:sz w:val="20"/>
+              </w:rPr>
+              <w:t>Ta réponse</w:t>
+            </w:r>
+          </w:p>
+        </w:tc>
+      </w:tr>
+      <w:tr>
+        <w:trPr>
+          <w:trHeight w:val="510"/>
+          <w:cantSplit/>
+        </w:trPr>
+        <w:tc>
+          <w:tcPr>
+            <w:tcW w:type="dxa" w:w="5896"/>
+          </w:tcPr>
+          <w:p>
+            <w:pPr>
+              <w:spacing w:after="0"/>
+            </w:pPr>
+            <w:r>
+              <w:rPr>
+                <w:sz w:val="20"/>
+              </w:rPr>
+              <w:t>Nombre de lignes affiché dans Extractions, avec les critères de Nadia</w:t>
+            </w:r>
+          </w:p>
+        </w:tc>
+        <w:tc>
+          <w:tcPr>
+            <w:tcW w:type="dxa" w:w="3742"/>
+          </w:tcPr>
+          <w:p/>
+        </w:tc>
+      </w:tr>
+    </w:tbl>
+    <w:p>
+      <w:pPr>
+        <w:keepNext/>
+        <w:spacing w:after="0" w:line="60" w:lineRule="exact"/>
+      </w:pPr>
+      <w:r>
+        <w:rPr>
+          <w:sz w:val="10"/>
+        </w:rPr>
+      </w:r>
+    </w:p>
+    <w:tbl>
+      <w:tblPr>
+        <w:tblStyle w:val="TableGrid"/>
+        <w:tblW w:type="auto" w:w="0"/>
+        <w:jc w:val="left"/>
+        <w:tblLook w:firstColumn="1" w:firstRow="1" w:lastColumn="0" w:lastRow="0" w:noHBand="0" w:noVBand="1" w:val="04A0"/>
+      </w:tblPr>
+      <w:tblGrid>
+        <w:gridCol w:w="10086"/>
+      </w:tblGrid>
+      <w:tr>
+        <w:trPr>
+          <w:cantSplit/>
+        </w:trPr>
+        <w:tc>
+          <w:tcPr>
+            <w:tcW w:type="dxa" w:w="10086"/>
+            <w:shd w:fill="F2F2F2"/>
+          </w:tcPr>
+          <w:p>
+            <w:pPr>
+              <w:keepNext/>
+              <w:spacing w:after="40"/>
+            </w:pPr>
+            <w:r>
+              <w:rPr>
+                <w:b/>
+                <w:color w:val="111111"/>
+                <w:sz w:val="20"/>
+              </w:rPr>
+              <w:t>Ce que tu dois voir dans ton fichier :</w:t>
             </w:r>
           </w:p>
           <w:p>
@@ -2052,7 +2403,20 @@
               <w:rPr>
                 <w:sz w:val="20"/>
               </w:rPr>
-              <w:t>•  dans « Préparations », une ligne par article préparé, avec le stock du logiciel et le stock trouvé ;</w:t>
+              <w:t>•  dans « Préparations », une ligne par article préparé, avec le stock du logiciel et le stock trouvé ; toutes les lignes sont de l'allée A (colonne « Emplacement » : A-…) ;</w:t>
+            </w:r>
+          </w:p>
+          <w:p>
+            <w:pPr>
+              <w:keepNext/>
+              <w:spacing w:before="0" w:after="40"/>
+              <w:ind w:left="397" w:hanging="227"/>
+            </w:pPr>
+            <w:r>
+              <w:rPr>
+                <w:sz w:val="20"/>
+              </w:rPr>
+              <w:t>•  autant de lignes de données (sans la ligne des titres) que le nombre affiché dans Extractions ;</w:t>
             </w:r>
           </w:p>
           <w:p>
@@ -2108,7 +2472,7 @@
               <w:rPr>
                 <w:sz w:val="20"/>
               </w:rPr>
-              <w:t>le bouton est aussi dans le menu « Fichiers ». Un nouvel export redonne les mêmes lignes.</w:t>
+              <w:t>retourne dans « Extractions » et exporte de nouveau, avec les mêmes critères : tu obtiens les mêmes lignes. Le menu « Fichiers » ne sert qu'à déposer.</w:t>
             </w:r>
           </w:p>
         </w:tc>
@@ -2190,7 +2554,7 @@
               <w:rPr>
                 <w:sz w:val="20"/>
               </w:rPr>
-              <w:t>Combien de lignes de préparation contient l'export (sans la ligne des titres) ?</w:t>
+              <w:t>Ton fichier a-t-il le même nombre de lignes que l'écran Extractions ? (oui / non)</w:t>
             </w:r>
           </w:p>
         </w:tc>
@@ -2346,6 +2710,70 @@
                 <w:sz w:val="21"/>
               </w:rPr>
               <w:t>Choisis une ligne où le stock trouvé n'est pas égal au stock logiciel. Qu'a-t-il pu se passer dans le rayon ?</w:t>
+            </w:r>
+          </w:p>
+          <w:p>
+            <w:pPr>
+              <w:spacing w:before="0" w:after="80"/>
+            </w:pPr>
+            <w:r>
+              <w:rPr>
+                <w:sz w:val="22"/>
+              </w:rPr>
+            </w:r>
+          </w:p>
+          <w:p>
+            <w:pPr>
+              <w:spacing w:before="0" w:after="80"/>
+            </w:pPr>
+            <w:r>
+              <w:rPr>
+                <w:sz w:val="22"/>
+              </w:rPr>
+            </w:r>
+          </w:p>
+          <w:p>
+            <w:pPr>
+              <w:spacing w:before="0" w:after="80"/>
+            </w:pPr>
+            <w:r>
+              <w:rPr>
+                <w:sz w:val="22"/>
+              </w:rPr>
+            </w:r>
+          </w:p>
+          <w:p>
+            <w:pPr>
+              <w:spacing w:before="0" w:after="80"/>
+            </w:pPr>
+            <w:r>
+              <w:rPr>
+                <w:sz w:val="22"/>
+              </w:rPr>
+            </w:r>
+          </w:p>
+        </w:tc>
+      </w:tr>
+      <w:tr>
+        <w:trPr>
+          <w:cantSplit/>
+          <w:trHeight w:val="2438"/>
+        </w:trPr>
+        <w:tc>
+          <w:tcPr>
+            <w:tcW w:type="dxa" w:w="10086"/>
+            <w:shd w:fill="FAFAFA"/>
+          </w:tcPr>
+          <w:p>
+            <w:pPr>
+              <w:spacing w:after="80"/>
+            </w:pPr>
+            <w:r>
+              <w:rPr>
+                <w:b/>
+                <w:sz w:val="21"/>
+              </w:rPr>
+              <w:t>Pourquoi choisir les lignes dans le logiciel, plutôt que tout exporter et faire le tri dans le tableur ?</w:t>
             </w:r>
           </w:p>
           <w:p>
@@ -4360,6 +4788,19 @@
               <w:rPr>
                 <w:sz w:val="20"/>
               </w:rPr>
+              <w:t>•  une ligne sur ton export : « ✓ Export : vos critères donnent bien les lignes demandées. », ou « ✗ Export à refaire (Extractions) » suivi du critère à changer ;</w:t>
+            </w:r>
+          </w:p>
+          <w:p>
+            <w:pPr>
+              <w:keepNext/>
+              <w:spacing w:before="0" w:after="40"/>
+              <w:ind w:left="397" w:hanging="227"/>
+            </w:pPr>
+            <w:r>
+              <w:rPr>
+                <w:sz w:val="20"/>
+              </w:rPr>
               <w:t>•  une phrase « … résultats justes sur … » ;</w:t>
             </w:r>
           </w:p>
@@ -4373,6 +4814,50 @@
                 <w:sz w:val="20"/>
               </w:rPr>
               <w:t>•  un tableau : une ligne par calcul, ✓ s'il est juste, ✗ sinon, et la colonne « Ce qui cloche ».</w:t>
+            </w:r>
+          </w:p>
+        </w:tc>
+      </w:tr>
+    </w:tbl>
+    <w:p>
+      <w:pPr>
+        <w:keepNext/>
+        <w:spacing w:after="40"/>
+      </w:pPr>
+    </w:p>
+    <w:tbl>
+      <w:tblPr>
+        <w:tblStyle w:val="TableGrid"/>
+        <w:tblW w:type="auto" w:w="0"/>
+        <w:jc w:val="left"/>
+        <w:tblLook w:firstColumn="1" w:firstRow="1" w:lastColumn="0" w:lastRow="0" w:noHBand="0" w:noVBand="1" w:val="04A0"/>
+      </w:tblPr>
+      <w:tblGrid>
+        <w:gridCol w:w="10086"/>
+      </w:tblGrid>
+      <w:tr>
+        <w:tc>
+          <w:tcPr>
+            <w:tcW w:type="dxa" w:w="10086"/>
+            <w:shd w:fill="F2F2F2"/>
+          </w:tcPr>
+          <w:p>
+            <w:pPr>
+              <w:spacing w:after="0"/>
+            </w:pPr>
+            <w:r>
+              <w:rPr>
+                <w:b/>
+                <w:color w:val="111111"/>
+                <w:sz w:val="20"/>
+              </w:rPr>
+              <w:t xml:space="preserve">Si l'export est ✗ : </w:t>
+            </w:r>
+            <w:r>
+              <w:rPr>
+                <w:sz w:val="20"/>
+              </w:rPr>
+              <w:t>le site te dit quel critère changer. Retourne dans « Extractions », règle-le, exporte de nouveau, recopie tes formules dans le nouveau fichier et redépose. Une erreur d'export ne te coûte que ce point-là : tes calculs sont contrôlés sur le fichier que tu as réellement exporté.</w:t>
             </w:r>
           </w:p>
         </w:tc>
@@ -4640,7 +5125,7 @@
               <w:rPr>
                 <w:sz w:val="20"/>
               </w:rPr>
-              <w:t>le site affiche « Tout est juste. »</w:t>
+              <w:t>le site affiche « ✓ Export » et « Tout est juste. »</w:t>
             </w:r>
           </w:p>
         </w:tc>

</xml_diff>